<commit_message>
wip Added x in R and z in R symbols
</commit_message>
<xml_diff>
--- a/bin/character-samples/symbols-math-other.docx
+++ b/bin/character-samples/symbols-math-other.docx
@@ -62,10 +62,20 @@
         <w:t>y ∝ = ≅ &lt; &gt; ≤  ≥ →  x² x³ xⁿ ±∞ ⋅ × ÷ √[] V₀ δ ε θ λ π ω  45° 100℃  98.6℉</w:t>
       </w:r>
     </w:p>
+    <w:p>
+      <w:pPr>
+        <w:pStyle w:val="Normal"/>
+        <w:rPr/>
+      </w:pPr>
+      <w:r>
+        <w:rPr/>
+        <w:t>x∊ ℝ  z∊ ℂ</w:t>
+      </w:r>
+    </w:p>
     <w:tbl>
       <w:tblPr>
         <w:jc w:val="left"/>
-        <w:tblInd w:w="0" w:type="dxa"/>
+        <w:tblInd w:w="-5" w:type="dxa"/>
         <w:tblBorders>
           <w:top w:val="single" w:sz="4" w:space="0" w:color="00000A"/>
           <w:left w:val="single" w:sz="4" w:space="0" w:color="00000A"/>
@@ -76,13 +86,13 @@
         </w:tblBorders>
         <w:tblCellMar>
           <w:top w:w="0" w:type="dxa"/>
-          <w:left w:w="108" w:type="dxa"/>
+          <w:left w:w="103" w:type="dxa"/>
           <w:bottom w:w="0" w:type="dxa"/>
           <w:right w:w="108" w:type="dxa"/>
         </w:tblCellMar>
       </w:tblPr>
       <w:tblGrid>
-        <w:gridCol w:w="4657"/>
+        <w:gridCol w:w="4656"/>
         <w:gridCol w:w="4656"/>
       </w:tblGrid>
       <w:tr>
@@ -92,7 +102,7 @@
         </w:trPr>
         <w:tc>
           <w:tcPr>
-            <w:tcW w:w="4657" w:type="dxa"/>
+            <w:tcW w:w="4656" w:type="dxa"/>
             <w:tcBorders>
               <w:top w:val="single" w:sz="4" w:space="0" w:color="00000A"/>
               <w:left w:val="single" w:sz="4" w:space="0" w:color="00000A"/>
@@ -101,9 +111,9 @@
               <w:right w:val="single" w:sz="4" w:space="0" w:color="00000A"/>
               <w:insideV w:val="single" w:sz="4" w:space="0" w:color="00000A"/>
             </w:tcBorders>
-            <w:shd w:fill="auto" w:val="clear"/>
+            <w:shd w:fill="FFFFFF" w:val="clear"/>
             <w:tcMar>
-              <w:left w:w="108" w:type="dxa"/>
+              <w:left w:w="103" w:type="dxa"/>
             </w:tcMar>
           </w:tcPr>
           <w:p>
@@ -470,9 +480,9 @@
               <w:right w:val="single" w:sz="4" w:space="0" w:color="00000A"/>
               <w:insideV w:val="single" w:sz="4" w:space="0" w:color="00000A"/>
             </w:tcBorders>
-            <w:shd w:fill="auto" w:val="clear"/>
+            <w:shd w:fill="FFFFFF" w:val="clear"/>
             <w:tcMar>
-              <w:left w:w="108" w:type="dxa"/>
+              <w:left w:w="103" w:type="dxa"/>
             </w:tcMar>
           </w:tcPr>
           <w:p>
@@ -1115,6 +1125,11 @@
     <w:p>
       <w:pPr>
         <w:pStyle w:val="Normal"/>
+        <w:widowControl/>
+        <w:suppressAutoHyphens w:val="true"/>
+        <w:bidi w:val="0"/>
+        <w:spacing w:lineRule="auto" w:line="276" w:before="0" w:after="160"/>
+        <w:jc w:val="left"/>
         <w:rPr>
           <w:sz w:val="15"/>
           <w:szCs w:val="15"/>
@@ -1125,28 +1140,7 @@
           <w:sz w:val="15"/>
           <w:szCs w:val="15"/>
         </w:rPr>
-        <w:t>V</w:t>
-      </w:r>
-      <w:r>
-        <w:rPr>
-          <w:sz w:val="15"/>
-          <w:szCs w:val="15"/>
-        </w:rPr>
-        <w:t>1.</w:t>
-      </w:r>
-      <w:r>
-        <w:rPr>
-          <w:sz w:val="15"/>
-          <w:szCs w:val="15"/>
-        </w:rPr>
-        <w:t>2</w:t>
-      </w:r>
-      <w:r>
-        <w:rPr>
-          <w:sz w:val="15"/>
-          <w:szCs w:val="15"/>
-        </w:rPr>
-        <w:t xml:space="preserve"> (apostrophe, 20</w:t>
+        <w:t>V1.2 (apostrophe, 20</w:t>
       </w:r>
       <w:r>
         <w:rPr>
@@ -1161,14 +1155,14 @@
           <w:sz w:val="15"/>
           <w:szCs w:val="15"/>
         </w:rPr>
-        <w:t xml:space="preserve">C, </w:t>
+        <w:t>C, equation,</w:t>
       </w:r>
       <w:r>
         <w:rPr>
           <w:sz w:val="15"/>
           <w:szCs w:val="15"/>
         </w:rPr>
-        <w:t>equation</w:t>
+        <w:t>x in R</w:t>
       </w:r>
       <w:r>
         <w:rPr>
@@ -1179,27 +1173,17 @@
       </w:r>
       <w:r>
         <w:pict>
-          <v:rect stroked="f" strokeweight="0pt" style="position:absolute;width:46.95pt;height:29.15pt;mso-wrap-distance-left:0pt;mso-wrap-distance-right:0pt;mso-wrap-distance-top:0pt;mso-wrap-distance-bottom:0pt;margin-top:0pt;margin-left:0.05pt">
+          <v:rect fillcolor="#FFFFFF" stroked="f" strokeweight="0pt" style="position:absolute;width:46.95pt;height:29.15pt;mso-wrap-distance-left:0pt;mso-wrap-distance-right:0pt;mso-wrap-distance-top:0pt;mso-wrap-distance-bottom:0pt;margin-top:0pt;margin-left:0.05pt">
             <v:textbox inset="0.277777777777778in,0in,0in,0.208333333333333in">
               <w:txbxContent>
                 <w:p>
                   <w:pPr>
                     <w:pStyle w:val="FrameContents"/>
                     <w:spacing w:before="0" w:after="0"/>
-                    <w:rPr>
-                      <w:rFonts w:eastAsia="Aptos" w:cs="Aptos"/>
-                      <w:color w:val="000000"/>
-                      <w:sz w:val="20"/>
-                      <w:szCs w:val="20"/>
-                    </w:rPr>
+                    <w:rPr/>
                   </w:pPr>
                   <w:r>
-                    <w:rPr>
-                      <w:rFonts w:eastAsia="Aptos" w:cs="Aptos"/>
-                      <w:color w:val="000000"/>
-                      <w:sz w:val="20"/>
-                      <w:szCs w:val="20"/>
-                    </w:rPr>
+                    <w:rPr/>
                   </w:r>
                 </w:p>
               </w:txbxContent>
@@ -1234,7 +1218,7 @@
     </w:r>
     <w:r>
       <w:pict>
-        <v:rect stroked="f" strokeweight="0pt" style="position:absolute;width:46.95pt;height:40pt;mso-wrap-distance-left:0pt;mso-wrap-distance-right:0pt;mso-wrap-distance-top:0pt;mso-wrap-distance-bottom:0pt;margin-top:0pt;margin-left:0.05pt">
+        <v:rect fillcolor="#FFFFFF" stroked="f" strokeweight="0pt" style="position:absolute;width:46.95pt;height:40pt;mso-wrap-distance-left:0pt;mso-wrap-distance-right:0pt;mso-wrap-distance-top:0pt;mso-wrap-distance-bottom:0pt;margin-top:0pt;margin-left:0.05pt">
           <v:textbox inset="0.277777777777778in,0in,0in,0.208333333333333in">
             <w:txbxContent>
               <w:p>
@@ -1675,7 +1659,7 @@
     </w:pPr>
     <w:rPr>
       <w:rFonts w:ascii="Aptos" w:hAnsi="Aptos" w:eastAsia="Droid Sans Fallback" w:cs="Aptos"/>
-      <w:color w:val="auto"/>
+      <w:color w:val="00000A"/>
       <w:sz w:val="24"/>
       <w:szCs w:val="24"/>
       <w:lang w:val="en-GB" w:eastAsia="en-US" w:bidi="ar-SA"/>

</xml_diff>